<commit_message>
docs(framework): describe the services, the outbox and the repositories
</commit_message>
<xml_diff>
--- a/Indroduccion_a_framework.docx
+++ b/Indroduccion_a_framework.docx
@@ -596,7 +596,7 @@
           <w:effect w:val="none"/>
           <w:shd w:fill="auto" w:val="clear"/>
         </w:rPr>
-        <w:t>El documento abarca el análisis y diseño de toda la parte frontend web y móvil integrado con la parte backend, el cual va a ser desarrollado en Java utilizando Spring Boot. </w:t>
+        <w:t xml:space="preserve">El documento abarca el análisis y diseño de toda la parte frontend web y móvil integrado con la parte backend, desarrollada en Java 21 con Spring Boot y organizada en un API gateway, tres microservicios (seguridad, dispositivos y mediciones) y un monolito modular con los contextos restantes, cuya migración a microservicios se encuentra en curso. </w:t>
       </w:r>
     </w:p>
     <w:p>
@@ -1595,7 +1595,7 @@
         <w:rPr>
           <w:rFonts w:ascii="arial" w:hAnsi="arial"/>
         </w:rPr>
-        <w:t>Comunicación segura TLS entre dispositivo y backend</w:t>
+        <w:t>Comunicación segura TLS entre el dispositivo y el broker, que autentica cada dispositivo ante el servicio de dispositivos</w:t>
       </w:r>
     </w:p>
     <w:p>
@@ -4070,7 +4070,7 @@
         <w:rPr>
           <w:rFonts w:ascii="arial" w:hAnsi="arial"/>
         </w:rPr>
-        <w:t>Validación backend</w:t>
+        <w:t>Validación en el backend (API gateway y servicio de seguridad)</w:t>
       </w:r>
     </w:p>
     <w:p>
@@ -4527,7 +4527,27 @@
         <w:rPr>
           <w:rFonts w:ascii="arial" w:hAnsi="arial"/>
         </w:rPr>
-        <w:t>Módulos de dominio (Spring Modulith)</w:t>
+        <w:t>Microservicios por contexto detrás de un API gateway y módulos de dominio (Spring Modulith) en el backend</w:t>
+      </w:r>
+    </w:p>
+    <w:p>
+      <w:pPr>
+        <w:pStyle w:val="Normal"/>
+        <w:numPr>
+          <w:ilvl w:val="0"/>
+          <w:numId w:val="22"/>
+        </w:numPr>
+        <w:bidi w:val="0"/>
+        <w:jc w:val="left"/>
+        <w:rPr>
+          <w:rFonts w:ascii="arial" w:hAnsi="arial"/>
+        </w:rPr>
+      </w:pPr>
+      <w:r>
+        <w:rPr>
+          <w:rFonts w:ascii="arial" w:hAnsi="arial"/>
+        </w:rPr>
+        <w:t>Transactional outbox (eventos entre servicios en RabbitMQ)</w:t>
       </w:r>
     </w:p>
     <w:p>
@@ -4739,7 +4759,47 @@
         <w:rPr>
           <w:rFonts w:ascii="arial" w:hAnsi="arial"/>
         </w:rPr>
-        <w:t>Spring Modulith → módulos (security, home, device, measurement, alert, recommendation, notification)</w:t>
+        <w:t>Spring Modulith → módulos del backend (home, alert, recommendation, notification); security, device y measurement ya funcionan como microservicios</w:t>
+      </w:r>
+    </w:p>
+    <w:p>
+      <w:pPr>
+        <w:pStyle w:val="Normal"/>
+        <w:numPr>
+          <w:ilvl w:val="0"/>
+          <w:numId w:val="24"/>
+        </w:numPr>
+        <w:bidi w:val="0"/>
+        <w:jc w:val="left"/>
+        <w:rPr>
+          <w:rFonts w:ascii="arial" w:hAnsi="arial"/>
+        </w:rPr>
+      </w:pPr>
+      <w:r>
+        <w:rPr>
+          <w:rFonts w:ascii="arial" w:hAnsi="arial"/>
+        </w:rPr>
+        <w:t>API Gateway → única entrada de la API (Spring Cloud Gateway, puerto 8080), que enruta cada petición al servicio correspondiente</w:t>
+      </w:r>
+    </w:p>
+    <w:p>
+      <w:pPr>
+        <w:pStyle w:val="Normal"/>
+        <w:numPr>
+          <w:ilvl w:val="0"/>
+          <w:numId w:val="24"/>
+        </w:numPr>
+        <w:bidi w:val="0"/>
+        <w:jc w:val="left"/>
+        <w:rPr>
+          <w:rFonts w:ascii="arial" w:hAnsi="arial"/>
+        </w:rPr>
+      </w:pPr>
+      <w:r>
+        <w:rPr>
+          <w:rFonts w:ascii="arial" w:hAnsi="arial"/>
+        </w:rPr>
+        <w:t>Transactional outbox → el evento se guarda en la misma transacción que el cambio y luego se publica en RabbitMQ</w:t>
       </w:r>
     </w:p>
     <w:p>
@@ -5275,7 +5335,7 @@
         <w:rPr>
           <w:rFonts w:ascii="arial" w:hAnsi="arial"/>
         </w:rPr>
-        <w:t>MQTT es un protocolo de mensajería ligero de tipo publicación/suscripción (pub/sub) sobre TCP, pensado para dispositivos con recursos limitados. El ESP32 publica las mediciones en el broker (Mosquitto) y el backend se suscribe al tema correspondiente, de modo que recibe la telemetría en tiempo real sin tener que consultarla por HTTP.</w:t>
+        <w:t>MQTT es un protocolo de mensajería ligero de tipo publicación/suscripción (pub/sub) sobre TCP, pensado para dispositivos con recursos limitados. El ESP32 publica las mediciones en el broker (Mosquitto) y los servicios de dispositivos y de mediciones se suscriben al tema correspondiente, de modo que reciben la telemetría en tiempo real sin tener que consultarla por HTTP.</w:t>
       </w:r>
     </w:p>
     <w:p>
@@ -5428,13 +5488,101 @@
         <w:rPr>
           <w:rFonts w:ascii="arial" w:hAnsi="arial"/>
         </w:rPr>
+        <w:t xml:space="preserve">│ ├── </w:t>
+      </w:r>
+      <w:r>
+        <w:rPr>
+          <w:rFonts w:ascii="arial" w:hAnsi="arial"/>
+        </w:rPr>
+        <w:t>en-monitor-api-gateway/ (Spring Cloud Gateway, puerto 8080)</w:t>
+      </w:r>
+    </w:p>
+    <w:p>
+      <w:pPr>
+        <w:pStyle w:val="Normal"/>
+        <w:bidi w:val="0"/>
+        <w:jc w:val="left"/>
+        <w:rPr>
+          <w:rFonts w:ascii="arial" w:hAnsi="arial"/>
+        </w:rPr>
+      </w:pPr>
+      <w:r>
+        <w:rPr>
+          <w:rFonts w:ascii="arial" w:hAnsi="arial"/>
+        </w:rPr>
+        <w:t xml:space="preserve">│ ├── </w:t>
+      </w:r>
+      <w:r>
+        <w:rPr>
+          <w:rFonts w:ascii="arial" w:hAnsi="arial"/>
+        </w:rPr>
+        <w:t>en-monitor-security-service/ (seguridad, puerto 8082)</w:t>
+      </w:r>
+    </w:p>
+    <w:p>
+      <w:pPr>
+        <w:pStyle w:val="Normal"/>
+        <w:bidi w:val="0"/>
+        <w:jc w:val="left"/>
+        <w:rPr>
+          <w:rFonts w:ascii="arial" w:hAnsi="arial"/>
+        </w:rPr>
+      </w:pPr>
+      <w:r>
+        <w:rPr>
+          <w:rFonts w:ascii="arial" w:hAnsi="arial"/>
+        </w:rPr>
+        <w:t xml:space="preserve">│ ├── </w:t>
+      </w:r>
+      <w:r>
+        <w:rPr>
+          <w:rFonts w:ascii="arial" w:hAnsi="arial"/>
+        </w:rPr>
+        <w:t>en-monitor-device-service/ (dispositivos, puerto 8084)</w:t>
+      </w:r>
+    </w:p>
+    <w:p>
+      <w:pPr>
+        <w:pStyle w:val="Normal"/>
+        <w:bidi w:val="0"/>
+        <w:jc w:val="left"/>
+        <w:rPr>
+          <w:rFonts w:ascii="arial" w:hAnsi="arial"/>
+        </w:rPr>
+      </w:pPr>
+      <w:r>
+        <w:rPr>
+          <w:rFonts w:ascii="arial" w:hAnsi="arial"/>
+        </w:rPr>
+        <w:t xml:space="preserve">│ ├── </w:t>
+      </w:r>
+      <w:r>
+        <w:rPr>
+          <w:rFonts w:ascii="arial" w:hAnsi="arial"/>
+        </w:rPr>
+        <w:t>en-monitor-measurement-service/ (mediciones, puerto 8085)</w:t>
+      </w:r>
+    </w:p>
+    <w:p>
+      <w:pPr>
+        <w:pStyle w:val="Normal"/>
+        <w:bidi w:val="0"/>
+        <w:jc w:val="left"/>
+        <w:rPr>
+          <w:rFonts w:ascii="arial" w:hAnsi="arial"/>
+        </w:rPr>
+      </w:pPr>
+      <w:r>
+        <w:rPr>
+          <w:rFonts w:ascii="arial" w:hAnsi="arial"/>
+        </w:rPr>
         <w:t xml:space="preserve">│ └── </w:t>
       </w:r>
       <w:r>
         <w:rPr>
           <w:rFonts w:ascii="arial" w:hAnsi="arial"/>
         </w:rPr>
-        <w:t>energy-monitor-backend/ (Spring Boot, Spring Modulith)</w:t>
+        <w:t>energy-monitor-backend/ (Spring Modulith: home, alert, recommendation, notification; puerto 8083; incluye firmware/ del ESP32)</w:t>
       </w:r>
     </w:p>
     <w:p>
@@ -5456,51 +5604,7 @@
         <w:rPr>
           <w:rFonts w:ascii="arial" w:hAnsi="arial"/>
         </w:rPr>
-        <w:t>devices/</w:t>
-      </w:r>
-    </w:p>
-    <w:p>
-      <w:pPr>
-        <w:pStyle w:val="Normal"/>
-        <w:bidi w:val="0"/>
-        <w:jc w:val="left"/>
-        <w:rPr>
-          <w:rFonts w:ascii="arial" w:hAnsi="arial"/>
-        </w:rPr>
-      </w:pPr>
-      <w:r>
-        <w:rPr>
-          <w:rFonts w:ascii="arial" w:hAnsi="arial"/>
-        </w:rPr>
-        <w:t xml:space="preserve">├── </w:t>
-      </w:r>
-      <w:r>
-        <w:rPr>
-          <w:rFonts w:ascii="arial" w:hAnsi="arial"/>
-        </w:rPr>
-        <w:t>esp32/ (firmware del dispositivo)</w:t>
-      </w:r>
-    </w:p>
-    <w:p>
-      <w:pPr>
-        <w:pStyle w:val="Normal"/>
-        <w:bidi w:val="0"/>
-        <w:jc w:val="left"/>
-        <w:rPr>
-          <w:rFonts w:ascii="arial" w:hAnsi="arial"/>
-        </w:rPr>
-      </w:pPr>
-      <w:r>
-        <w:rPr>
-          <w:rFonts w:ascii="arial" w:hAnsi="arial"/>
-        </w:rPr>
-        <w:t xml:space="preserve">└── </w:t>
-      </w:r>
-      <w:r>
-        <w:rPr>
-          <w:rFonts w:ascii="arial" w:hAnsi="arial"/>
-        </w:rPr>
-        <w:t>docker/ (broker MQTT Mosquitto)</w:t>
+        <w:t>infra/ (Docker Compose, broker MQTT Mosquitto, despliegue y pruebas de punta a punta)</w:t>
       </w:r>
     </w:p>
     <w:sectPr>

</xml_diff>